<commit_message>
Update Slide-Build-Instructions-FINAL.docx to newest version
Replaces the earlier draft with the final build instructions document
that includes updated content, screenshots, and DQL queries for all
49 slides of Session 8.

Co-Authored-By: Claude Sonnet 4.6 <noreply@anthropic.com>
Claude-Session: https://claude.ai/code/session_015pQqW2UrwzcwwppsYQbrkt
</commit_message>
<xml_diff>
--- a/wayfinder-engine-main/AI-automation/inputs/Slide-Build-Instructions-FINAL.docx
+++ b/wayfinder-engine-main/AI-automation/inputs/Slide-Build-Instructions-FINAL.docx
@@ -7373,8 +7373,6 @@
       <w:pPr>
         <w:spacing w:after="60"/>
         <w:ind w:left="280"/>
-      </w:pPr>
-      <w:r>
         <w:rPr>
           <w:b/>
           <w:bCs/>
@@ -7382,7 +7380,145 @@
           <w:sz w:val="19"/>
           <w:szCs w:val="19"/>
         </w:rPr>
+      </w:pPr>
+      <w:r>
+        <w:rPr>
+          <w:b/>
+          <w:bCs/>
+          <w:color w:val="C00000"/>
+          <w:sz w:val="19"/>
+          <w:szCs w:val="19"/>
+        </w:rPr>
         <w:t>VISUAL — Built-in rule JSON with the grouping field and matcher highlighted.</w:t>
+      </w:r>
+    </w:p>
+    <w:p>
+      <w:r>
+        <w:rPr>
+          <w:b/>
+          <w:bCs/>
+        </w:rPr>
+        <w:t>Reference of DT out of the box rule:</w:t>
+      </w:r>
+      <w:r>
+        <w:rPr>
+          <w:b/>
+          <w:bCs/>
+        </w:rPr>
+        <w:br/>
+      </w:r>
+      <w:r>
+        <w:t>{</w:t>
+      </w:r>
+    </w:p>
+    <w:p>
+      <w:r>
+        <w:t xml:space="preserve">  "displayName": "Correlate host infrastructure entities by host",</w:t>
+      </w:r>
+    </w:p>
+    <w:p>
+      <w:r>
+        <w:t xml:space="preserve">  "enabled": true,</w:t>
+      </w:r>
+    </w:p>
+    <w:p>
+      <w:r>
+        <w:t xml:space="preserve">  "timeWindow": "15m",</w:t>
+      </w:r>
+    </w:p>
+    <w:p>
+      <w:r>
+        <w:t xml:space="preserve">  "groupingFields": [</w:t>
+      </w:r>
+    </w:p>
+    <w:p>
+      <w:r>
+        <w:t xml:space="preserve">    "dt.smartscape.host"</w:t>
+      </w:r>
+    </w:p>
+    <w:p>
+      <w:r>
+        <w:t xml:space="preserve">  ],</w:t>
+      </w:r>
+    </w:p>
+    <w:p>
+      <w:r>
+        <w:t xml:space="preserve">  "matchingCondition": "matchesValue(dt.smartscape_source.type, {\"CONTAINER\", \"DISK\", \"NETWORK_INTERFACE\", \"PROCESS\", \"HOST\", \"OS_SERVICE\"})",</w:t>
+      </w:r>
+    </w:p>
+    <w:p>
+      <w:r>
+        <w:t xml:space="preserve">  "correlationNamespace": "default-dt.smartscape.host"</w:t>
+      </w:r>
+    </w:p>
+    <w:p>
+      <w:r>
+        <w:t>}</w:t>
+      </w:r>
+    </w:p>
+    <w:p>
+      <w:pPr>
+        <w:spacing w:after="60"/>
+        <w:ind w:left="280"/>
+      </w:pPr>
+      <w:r>
+        <w:br/>
+      </w:r>
+      <w:r>
+        <w:br/>
+        <w:t>or reference picture</w:t>
+      </w:r>
+    </w:p>
+    <w:p>
+      <w:pPr>
+        <w:spacing w:after="60"/>
+        <w:ind w:left="280"/>
+      </w:pPr>
+      <w:r>
+        <w:t xml:space="preserve"> </w:t>
+      </w:r>
+      <w:r>
+        <w:rPr>
+          <w:noProof/>
+        </w:rPr>
+        <w:drawing>
+          <wp:inline distT="0" distB="0" distL="0" distR="0" wp14:anchorId="146D5E11" wp14:editId="42BE6773">
+            <wp:extent cx="6940829" cy="5427717"/>
+            <wp:effectExtent l="0" t="0" r="0" b="1905"/>
+            <wp:docPr id="112360375" name="Picture 1"/>
+            <wp:cNvGraphicFramePr>
+              <a:graphicFrameLocks xmlns:a="http://schemas.openxmlformats.org/drawingml/2006/main" noChangeAspect="1"/>
+            </wp:cNvGraphicFramePr>
+            <a:graphic xmlns:a="http://schemas.openxmlformats.org/drawingml/2006/main">
+              <a:graphicData uri="http://schemas.openxmlformats.org/drawingml/2006/picture">
+                <pic:pic xmlns:pic="http://schemas.openxmlformats.org/drawingml/2006/picture">
+                  <pic:nvPicPr>
+                    <pic:cNvPr id="112360375" name=""/>
+                    <pic:cNvPicPr/>
+                  </pic:nvPicPr>
+                  <pic:blipFill>
+                    <a:blip r:embed="rId11"/>
+                    <a:stretch>
+                      <a:fillRect/>
+                    </a:stretch>
+                  </pic:blipFill>
+                  <pic:spPr>
+                    <a:xfrm>
+                      <a:off x="0" y="0"/>
+                      <a:ext cx="6948561" cy="5433763"/>
+                    </a:xfrm>
+                    <a:prstGeom prst="rect">
+                      <a:avLst/>
+                    </a:prstGeom>
+                  </pic:spPr>
+                </pic:pic>
+              </a:graphicData>
+            </a:graphic>
+          </wp:inline>
+        </w:drawing>
+      </w:r>
+      <w:r>
+        <w:br/>
       </w:r>
     </w:p>
     <w:p>
@@ -7483,8 +7619,6 @@
       <w:pPr>
         <w:spacing w:after="60"/>
         <w:ind w:left="280"/>
-      </w:pPr>
-      <w:r>
         <w:rPr>
           <w:b/>
           <w:bCs/>
@@ -7492,8 +7626,23 @@
           <w:sz w:val="19"/>
           <w:szCs w:val="19"/>
         </w:rPr>
+      </w:pPr>
+      <w:r>
+        <w:rPr>
+          <w:b/>
+          <w:bCs/>
+          <w:color w:val="C00000"/>
+          <w:sz w:val="19"/>
+          <w:szCs w:val="19"/>
+        </w:rPr>
         <w:t>VISUAL — Card B scenario with both volatile identity fields circled and a crossed-out rule attempt.</w:t>
       </w:r>
+    </w:p>
+    <w:p>
+      <w:pPr>
+        <w:spacing w:after="60"/>
+        <w:ind w:left="280"/>
+      </w:pPr>
     </w:p>
     <w:p>
       <w:pPr>
@@ -7538,6 +7687,24 @@
     </w:p>
     <w:p>
       <w:pPr>
+        <w:pStyle w:val="ListParagraph"/>
+        <w:numPr>
+          <w:ilvl w:val="0"/>
+          <w:numId w:val="1"/>
+        </w:numPr>
+      </w:pPr>
+      <w:r>
+        <w:t>Even if a correlation rule could technically group these events, the problem title inherits the first event's name — so you'd get a problem titled "Service: Error Rate Spike — eu-west-1" that actually spans three regions, which is misleading. Volatile values in event.name are always wrong, regardless of whether downstream merging can work around them</w:t>
+      </w:r>
+    </w:p>
+    <w:p>
+      <w:pPr>
+        <w:pStyle w:val="ListParagraph"/>
+        <w:ind w:left="720"/>
+      </w:pPr>
+    </w:p>
+    <w:p>
+      <w:pPr>
         <w:spacing w:before="260" w:after="100"/>
       </w:pPr>
       <w:r>
@@ -7582,8 +7749,6 @@
       <w:pPr>
         <w:spacing w:after="60"/>
         <w:ind w:left="280"/>
-      </w:pPr>
-      <w:r>
         <w:rPr>
           <w:b/>
           <w:bCs/>
@@ -7591,7 +7756,570 @@
           <w:sz w:val="19"/>
           <w:szCs w:val="19"/>
         </w:rPr>
+      </w:pPr>
+      <w:r>
+        <w:rPr>
+          <w:b/>
+          <w:bCs/>
+          <w:color w:val="C00000"/>
+          <w:sz w:val="19"/>
+          <w:szCs w:val="19"/>
+        </w:rPr>
         <w:t>VISUAL — SCHEMA: without namespace (deployment markers outside) vs. with namespace (all nine events in one problem).</w:t>
+      </w:r>
+    </w:p>
+    <w:p>
+      <w:pPr>
+        <w:rPr>
+          <w:b/>
+          <w:bCs/>
+        </w:rPr>
+      </w:pPr>
+      <w:r>
+        <w:rPr>
+          <w:b/>
+          <w:bCs/>
+          <w:color w:val="C00000"/>
+          <w:sz w:val="19"/>
+          <w:szCs w:val="19"/>
+        </w:rPr>
+        <w:t>Show rules 3 rules</w:t>
+      </w:r>
+      <w:r>
+        <w:rPr>
+          <w:b/>
+          <w:bCs/>
+          <w:color w:val="C00000"/>
+          <w:sz w:val="19"/>
+          <w:szCs w:val="19"/>
+        </w:rPr>
+        <w:br/>
+      </w:r>
+      <w:r>
+        <w:rPr>
+          <w:b/>
+          <w:bCs/>
+        </w:rPr>
+        <w:t>{</w:t>
+      </w:r>
+    </w:p>
+    <w:p>
+      <w:pPr>
+        <w:rPr>
+          <w:b/>
+          <w:bCs/>
+        </w:rPr>
+      </w:pPr>
+      <w:r>
+        <w:rPr>
+          <w:b/>
+          <w:bCs/>
+        </w:rPr>
+        <w:t xml:space="preserve">  "displayName": "Track deployment markers for change-impact correlation",</w:t>
+      </w:r>
+    </w:p>
+    <w:p>
+      <w:pPr>
+        <w:rPr>
+          <w:b/>
+          <w:bCs/>
+        </w:rPr>
+      </w:pPr>
+      <w:r>
+        <w:rPr>
+          <w:b/>
+          <w:bCs/>
+        </w:rPr>
+        <w:t xml:space="preserve">  "enabled": true,</w:t>
+      </w:r>
+    </w:p>
+    <w:p>
+      <w:pPr>
+        <w:rPr>
+          <w:b/>
+          <w:bCs/>
+        </w:rPr>
+      </w:pPr>
+      <w:r>
+        <w:rPr>
+          <w:b/>
+          <w:bCs/>
+        </w:rPr>
+        <w:t xml:space="preserve">  "timeWindow": "1h",</w:t>
+      </w:r>
+    </w:p>
+    <w:p>
+      <w:pPr>
+        <w:rPr>
+          <w:b/>
+          <w:bCs/>
+        </w:rPr>
+      </w:pPr>
+      <w:r>
+        <w:rPr>
+          <w:b/>
+          <w:bCs/>
+        </w:rPr>
+        <w:t xml:space="preserve">  "groupingFields": [</w:t>
+      </w:r>
+    </w:p>
+    <w:p>
+      <w:pPr>
+        <w:rPr>
+          <w:b/>
+          <w:bCs/>
+        </w:rPr>
+      </w:pPr>
+      <w:r>
+        <w:rPr>
+          <w:b/>
+          <w:bCs/>
+        </w:rPr>
+        <w:t xml:space="preserve">    "release_version"</w:t>
+      </w:r>
+    </w:p>
+    <w:p>
+      <w:pPr>
+        <w:rPr>
+          <w:b/>
+          <w:bCs/>
+        </w:rPr>
+      </w:pPr>
+      <w:r>
+        <w:rPr>
+          <w:b/>
+          <w:bCs/>
+        </w:rPr>
+        <w:t xml:space="preserve">  ],</w:t>
+      </w:r>
+    </w:p>
+    <w:p>
+      <w:pPr>
+        <w:rPr>
+          <w:b/>
+          <w:bCs/>
+        </w:rPr>
+      </w:pPr>
+      <w:r>
+        <w:rPr>
+          <w:b/>
+          <w:bCs/>
+        </w:rPr>
+        <w:t xml:space="preserve">  "matchingCondition": "event.type == \"CUSTOM_INFO\" and isNotNull(release_version)",</w:t>
+      </w:r>
+    </w:p>
+    <w:p>
+      <w:pPr>
+        <w:rPr>
+          <w:b/>
+          <w:bCs/>
+        </w:rPr>
+      </w:pPr>
+      <w:r>
+        <w:rPr>
+          <w:b/>
+          <w:bCs/>
+        </w:rPr>
+        <w:t xml:space="preserve">  "correlationNamespace": "release-impact-correlation"</w:t>
+      </w:r>
+    </w:p>
+    <w:p>
+      <w:pPr>
+        <w:rPr>
+          <w:b/>
+          <w:bCs/>
+        </w:rPr>
+      </w:pPr>
+      <w:r>
+        <w:rPr>
+          <w:b/>
+          <w:bCs/>
+        </w:rPr>
+        <w:t>}</w:t>
+      </w:r>
+    </w:p>
+    <w:p>
+      <w:pPr>
+        <w:rPr>
+          <w:b/>
+          <w:bCs/>
+        </w:rPr>
+      </w:pPr>
+    </w:p>
+    <w:p>
+      <w:pPr>
+        <w:spacing w:after="60"/>
+        <w:ind w:left="280"/>
+        <w:rPr>
+          <w:b/>
+          <w:bCs/>
+          <w:color w:val="C00000"/>
+          <w:sz w:val="19"/>
+          <w:szCs w:val="19"/>
+        </w:rPr>
+      </w:pPr>
+    </w:p>
+    <w:p>
+      <w:pPr>
+        <w:rPr>
+          <w:b/>
+          <w:bCs/>
+        </w:rPr>
+      </w:pPr>
+      <w:r>
+        <w:rPr>
+          <w:b/>
+          <w:bCs/>
+        </w:rPr>
+        <w:t>{</w:t>
+      </w:r>
+    </w:p>
+    <w:p>
+      <w:pPr>
+        <w:rPr>
+          <w:b/>
+          <w:bCs/>
+        </w:rPr>
+      </w:pPr>
+      <w:r>
+        <w:rPr>
+          <w:b/>
+          <w:bCs/>
+        </w:rPr>
+        <w:t xml:space="preserve">  "displayName": "Track early warning signals for change-impact correlation",</w:t>
+      </w:r>
+    </w:p>
+    <w:p>
+      <w:pPr>
+        <w:rPr>
+          <w:b/>
+          <w:bCs/>
+        </w:rPr>
+      </w:pPr>
+      <w:r>
+        <w:rPr>
+          <w:b/>
+          <w:bCs/>
+        </w:rPr>
+        <w:t xml:space="preserve">  "enabled": true,</w:t>
+      </w:r>
+    </w:p>
+    <w:p>
+      <w:pPr>
+        <w:rPr>
+          <w:b/>
+          <w:bCs/>
+        </w:rPr>
+      </w:pPr>
+      <w:r>
+        <w:rPr>
+          <w:b/>
+          <w:bCs/>
+        </w:rPr>
+        <w:t xml:space="preserve">  "timeWindow": "30m",</w:t>
+      </w:r>
+    </w:p>
+    <w:p>
+      <w:pPr>
+        <w:rPr>
+          <w:b/>
+          <w:bCs/>
+        </w:rPr>
+      </w:pPr>
+      <w:r>
+        <w:rPr>
+          <w:b/>
+          <w:bCs/>
+        </w:rPr>
+        <w:t xml:space="preserve">  "groupingFields": [</w:t>
+      </w:r>
+    </w:p>
+    <w:p>
+      <w:pPr>
+        <w:rPr>
+          <w:b/>
+          <w:bCs/>
+        </w:rPr>
+      </w:pPr>
+      <w:r>
+        <w:rPr>
+          <w:b/>
+          <w:bCs/>
+        </w:rPr>
+        <w:t xml:space="preserve">    "release_version"</w:t>
+      </w:r>
+    </w:p>
+    <w:p>
+      <w:pPr>
+        <w:rPr>
+          <w:b/>
+          <w:bCs/>
+        </w:rPr>
+      </w:pPr>
+      <w:r>
+        <w:rPr>
+          <w:b/>
+          <w:bCs/>
+        </w:rPr>
+        <w:t xml:space="preserve">  ],</w:t>
+      </w:r>
+    </w:p>
+    <w:p>
+      <w:pPr>
+        <w:rPr>
+          <w:b/>
+          <w:bCs/>
+        </w:rPr>
+      </w:pPr>
+      <w:r>
+        <w:rPr>
+          <w:b/>
+          <w:bCs/>
+        </w:rPr>
+        <w:t xml:space="preserve">  "matchingCondition": "event.type == \"WARNING\" and isNotNull(release_version)",</w:t>
+      </w:r>
+    </w:p>
+    <w:p>
+      <w:pPr>
+        <w:rPr>
+          <w:b/>
+          <w:bCs/>
+        </w:rPr>
+      </w:pPr>
+      <w:r>
+        <w:rPr>
+          <w:b/>
+          <w:bCs/>
+        </w:rPr>
+        <w:t xml:space="preserve">  "correlationNamespace": "release-impact-correlation"</w:t>
+      </w:r>
+    </w:p>
+    <w:p>
+      <w:pPr>
+        <w:rPr>
+          <w:b/>
+          <w:bCs/>
+        </w:rPr>
+      </w:pPr>
+      <w:r>
+        <w:rPr>
+          <w:b/>
+          <w:bCs/>
+        </w:rPr>
+        <w:t>}</w:t>
+      </w:r>
+    </w:p>
+    <w:p>
+      <w:pPr>
+        <w:spacing w:after="60"/>
+        <w:ind w:left="280"/>
+        <w:rPr>
+          <w:b/>
+          <w:bCs/>
+          <w:color w:val="C00000"/>
+          <w:sz w:val="19"/>
+          <w:szCs w:val="19"/>
+        </w:rPr>
+      </w:pPr>
+    </w:p>
+    <w:p>
+      <w:pPr>
+        <w:spacing w:after="60"/>
+        <w:ind w:left="280"/>
+        <w:rPr>
+          <w:b/>
+          <w:bCs/>
+          <w:color w:val="C00000"/>
+          <w:sz w:val="19"/>
+          <w:szCs w:val="19"/>
+        </w:rPr>
+      </w:pPr>
+    </w:p>
+    <w:p>
+      <w:pPr>
+        <w:rPr>
+          <w:b/>
+          <w:bCs/>
+        </w:rPr>
+      </w:pPr>
+      <w:r>
+        <w:rPr>
+          <w:b/>
+          <w:bCs/>
+        </w:rPr>
+        <w:t>{</w:t>
+      </w:r>
+    </w:p>
+    <w:p>
+      <w:pPr>
+        <w:rPr>
+          <w:b/>
+          <w:bCs/>
+        </w:rPr>
+      </w:pPr>
+      <w:r>
+        <w:rPr>
+          <w:b/>
+          <w:bCs/>
+        </w:rPr>
+        <w:t xml:space="preserve">  "displayName": "Correlate service errors to their triggering release",</w:t>
+      </w:r>
+    </w:p>
+    <w:p>
+      <w:pPr>
+        <w:rPr>
+          <w:b/>
+          <w:bCs/>
+        </w:rPr>
+      </w:pPr>
+      <w:r>
+        <w:rPr>
+          <w:b/>
+          <w:bCs/>
+        </w:rPr>
+        <w:t xml:space="preserve">  "enabled": true,</w:t>
+      </w:r>
+    </w:p>
+    <w:p>
+      <w:pPr>
+        <w:rPr>
+          <w:b/>
+          <w:bCs/>
+        </w:rPr>
+      </w:pPr>
+      <w:r>
+        <w:rPr>
+          <w:b/>
+          <w:bCs/>
+        </w:rPr>
+        <w:t xml:space="preserve">  "timeWindow": "15m",</w:t>
+      </w:r>
+    </w:p>
+    <w:p>
+      <w:pPr>
+        <w:rPr>
+          <w:b/>
+          <w:bCs/>
+        </w:rPr>
+      </w:pPr>
+      <w:r>
+        <w:rPr>
+          <w:b/>
+          <w:bCs/>
+        </w:rPr>
+        <w:t xml:space="preserve">  "groupingFields": [</w:t>
+      </w:r>
+    </w:p>
+    <w:p>
+      <w:pPr>
+        <w:rPr>
+          <w:b/>
+          <w:bCs/>
+        </w:rPr>
+      </w:pPr>
+      <w:r>
+        <w:rPr>
+          <w:b/>
+          <w:bCs/>
+        </w:rPr>
+        <w:t xml:space="preserve">    "release_version"</w:t>
+      </w:r>
+    </w:p>
+    <w:p>
+      <w:pPr>
+        <w:rPr>
+          <w:b/>
+          <w:bCs/>
+        </w:rPr>
+      </w:pPr>
+      <w:r>
+        <w:rPr>
+          <w:b/>
+          <w:bCs/>
+        </w:rPr>
+        <w:t xml:space="preserve">  ],</w:t>
+      </w:r>
+    </w:p>
+    <w:p>
+      <w:pPr>
+        <w:rPr>
+          <w:b/>
+          <w:bCs/>
+        </w:rPr>
+      </w:pPr>
+      <w:r>
+        <w:rPr>
+          <w:b/>
+          <w:bCs/>
+        </w:rPr>
+        <w:t xml:space="preserve">  "matchingCondition": "matchesValue(event.type, {\"ERROR_EVENT\", \"PERFORMANCE_EVENT\"}) and isNotNull(release_version)",</w:t>
+      </w:r>
+    </w:p>
+    <w:p>
+      <w:pPr>
+        <w:rPr>
+          <w:b/>
+          <w:bCs/>
+        </w:rPr>
+      </w:pPr>
+      <w:r>
+        <w:rPr>
+          <w:b/>
+          <w:bCs/>
+        </w:rPr>
+        <w:t xml:space="preserve">  "correlationNamespace": "release-impact-correlation"</w:t>
+      </w:r>
+    </w:p>
+    <w:p>
+      <w:pPr>
+        <w:rPr>
+          <w:b/>
+          <w:bCs/>
+        </w:rPr>
+      </w:pPr>
+      <w:r>
+        <w:rPr>
+          <w:b/>
+          <w:bCs/>
+        </w:rPr>
+        <w:t>}</w:t>
+      </w:r>
+    </w:p>
+    <w:p>
+      <w:pPr>
+        <w:spacing w:after="60"/>
+        <w:ind w:left="280"/>
+        <w:rPr>
+          <w:b/>
+          <w:bCs/>
+          <w:color w:val="C00000"/>
+          <w:sz w:val="19"/>
+          <w:szCs w:val="19"/>
+        </w:rPr>
+      </w:pPr>
+    </w:p>
+    <w:p>
+      <w:pPr>
+        <w:spacing w:after="60"/>
+        <w:ind w:left="280"/>
+        <w:rPr>
+          <w:b/>
+          <w:bCs/>
+        </w:rPr>
+      </w:pPr>
+      <w:r>
+        <w:rPr>
+          <w:b/>
+          <w:bCs/>
+        </w:rPr>
+        <w:t>Display these 3 rules separately horizontally in separate boxes or so maybe with json format..</w:t>
+      </w:r>
+      <w:r>
+        <w:rPr>
+          <w:b/>
+          <w:bCs/>
+        </w:rPr>
+        <w:br/>
       </w:r>
     </w:p>
     <w:p>
@@ -9421,8 +10149,6 @@
       <w:pPr>
         <w:spacing w:after="60"/>
         <w:ind w:left="280"/>
-      </w:pPr>
-      <w:r>
         <w:rPr>
           <w:b/>
           <w:bCs/>
@@ -9430,6 +10156,15 @@
           <w:sz w:val="19"/>
           <w:szCs w:val="19"/>
         </w:rPr>
+      </w:pPr>
+      <w:r>
+        <w:rPr>
+          <w:b/>
+          <w:bCs/>
+          <w:color w:val="C00000"/>
+          <w:sz w:val="19"/>
+          <w:szCs w:val="19"/>
+        </w:rPr>
         <w:t>VISUAL — SCREENSHOT (session owner): problem card — multiple entities, service impact, empty Root Cause. Visually distinct from slides 28–30 — this is the exception.</w:t>
       </w:r>
       <w:r>
@@ -9464,6 +10199,52 @@
           <w:highlight w:val="yellow"/>
         </w:rPr>
         <w:t xml:space="preserve"> Content doc)</w:t>
+      </w:r>
+    </w:p>
+    <w:p>
+      <w:pPr>
+        <w:spacing w:after="60"/>
+        <w:ind w:left="280"/>
+      </w:pPr>
+      <w:r>
+        <w:rPr>
+          <w:noProof/>
+        </w:rPr>
+        <w:drawing>
+          <wp:inline distT="0" distB="0" distL="0" distR="0" wp14:anchorId="6FE777C6" wp14:editId="1DEAE749">
+            <wp:extent cx="13644748" cy="7759264"/>
+            <wp:effectExtent l="0" t="0" r="0" b="0"/>
+            <wp:docPr id="1651754643" name="Picture 1"/>
+            <wp:cNvGraphicFramePr>
+              <a:graphicFrameLocks xmlns:a="http://schemas.openxmlformats.org/drawingml/2006/main" noChangeAspect="1"/>
+            </wp:cNvGraphicFramePr>
+            <a:graphic xmlns:a="http://schemas.openxmlformats.org/drawingml/2006/main">
+              <a:graphicData uri="http://schemas.openxmlformats.org/drawingml/2006/picture">
+                <pic:pic xmlns:pic="http://schemas.openxmlformats.org/drawingml/2006/picture">
+                  <pic:nvPicPr>
+                    <pic:cNvPr id="1651754643" name=""/>
+                    <pic:cNvPicPr/>
+                  </pic:nvPicPr>
+                  <pic:blipFill>
+                    <a:blip r:embed="rId12"/>
+                    <a:stretch>
+                      <a:fillRect/>
+                    </a:stretch>
+                  </pic:blipFill>
+                  <pic:spPr>
+                    <a:xfrm>
+                      <a:off x="0" y="0"/>
+                      <a:ext cx="13647153" cy="7760632"/>
+                    </a:xfrm>
+                    <a:prstGeom prst="rect">
+                      <a:avLst/>
+                    </a:prstGeom>
+                  </pic:spPr>
+                </pic:pic>
+              </a:graphicData>
+            </a:graphic>
+          </wp:inline>
+        </w:drawing>
       </w:r>
     </w:p>
     <w:p>
@@ -11973,10 +12754,6 @@
       </w:r>
     </w:p>
     <w:p>
-      <w:pPr>
-        <w:spacing w:after="60"/>
-        <w:ind w:left="280"/>
-      </w:pPr>
       <w:r>
         <w:rPr>
           <w:b/>
@@ -11985,12 +12762,14 @@
         <w:t xml:space="preserve">Answer: </w:t>
       </w:r>
       <w:r>
-        <w:t>Without it, a multi-layer problem also matches and gets hidden behind an expected label.</w:t>
-      </w:r>
-    </w:p>
-    <w:p>
-      <w:pPr>
-        <w:spacing w:before="260" w:after="100"/>
+        <w:t>without it, a problem with impact_level = [Services, Infrastructure] would also match the in("Infrastructure", ...) condition and get labelled expected_infra_stack — hiding a genuine multi-layer gap behind an "expected" label. The guard is what keeps the infra-stack bucket honest.</w:t>
+      </w:r>
+    </w:p>
+    <w:p/>
+    <w:p>
+      <w:pPr>
+        <w:spacing w:after="60"/>
+        <w:ind w:left="280"/>
       </w:pPr>
       <w:r>
         <w:rPr>
@@ -12050,7 +12829,20 @@
         <w:t xml:space="preserve">Check 1: </w:t>
       </w:r>
       <w:r>
-        <w:t>Was CUSTOM_ALERT the right category? A business ratio has no built-in type — yes, here.</w:t>
+        <w:t xml:space="preserve">Was CUSTOM_ALERT the right category? </w:t>
+      </w:r>
+      <w:r>
+        <w:rPr>
+          <w:b/>
+          <w:bCs/>
+        </w:rPr>
+        <w:t>Answer</w:t>
+      </w:r>
+      <w:r>
+        <w:t xml:space="preserve"> </w:t>
+      </w:r>
+      <w:r>
+        <w:t>yes, because a computed business ratio like conversion rate has no built-in event category to reserve for</w:t>
       </w:r>
     </w:p>
     <w:p>
@@ -12079,10 +12871,20 @@
           <w:b/>
           <w:bCs/>
         </w:rPr>
+        <w:br/>
+      </w:r>
+      <w:r>
+        <w:rPr>
+          <w:b/>
+          <w:bCs/>
+        </w:rPr>
         <w:t xml:space="preserve">Check 2: </w:t>
       </w:r>
       <w:r>
-        <w:t>Does the template carry the entity reference? Empty is correct when nothing can be bound.</w:t>
+        <w:t>Does the template carry the entity reference? Empty is correct when nothing can be bound</w:t>
+      </w:r>
+      <w:r>
+        <w:t>, but if smartscape entity can be mapped template shall not miss the reference</w:t>
       </w:r>
     </w:p>
     <w:p>
@@ -12098,7 +12900,17 @@
           <w:sz w:val="19"/>
           <w:szCs w:val="19"/>
         </w:rPr>
-        <w:t>VISUAL — Two-step decision flow with outcomes at each step.</w:t>
+        <w:t>VISUAL — Two-step decision flow with outcomes at each step</w:t>
+      </w:r>
+      <w:r>
+        <w:rPr>
+          <w:b/>
+          <w:bCs/>
+          <w:color w:val="C00000"/>
+          <w:sz w:val="19"/>
+          <w:szCs w:val="19"/>
+        </w:rPr>
+        <w:t>, maybe in table or 2 boxes format</w:t>
       </w:r>
     </w:p>
     <w:p>
@@ -12229,6 +13041,10 @@
       <w:pPr>
         <w:spacing w:after="60"/>
         <w:ind w:left="280"/>
+        <w:rPr>
+          <w:b/>
+          <w:bCs/>
+        </w:rPr>
       </w:pPr>
       <w:r>
         <w:rPr>
@@ -12236,6 +13052,126 @@
           <w:bCs/>
         </w:rPr>
         <w:t>Transferable point: A genuine gap does not always mean topology is missing. Sometimes it exists, but not the causally relevant kind.</w:t>
+      </w:r>
+    </w:p>
+    <w:p>
+      <w:pPr>
+        <w:spacing w:after="60"/>
+        <w:ind w:left="280"/>
+      </w:pPr>
+      <w:r>
+        <w:rPr>
+          <w:noProof/>
+        </w:rPr>
+        <w:drawing>
+          <wp:inline distT="0" distB="0" distL="0" distR="0" wp14:anchorId="22885929" wp14:editId="63D13875">
+            <wp:extent cx="12575969" cy="7661927"/>
+            <wp:effectExtent l="0" t="0" r="0" b="0"/>
+            <wp:docPr id="1641839456" name="Picture 1"/>
+            <wp:cNvGraphicFramePr>
+              <a:graphicFrameLocks xmlns:a="http://schemas.openxmlformats.org/drawingml/2006/main" noChangeAspect="1"/>
+            </wp:cNvGraphicFramePr>
+            <a:graphic xmlns:a="http://schemas.openxmlformats.org/drawingml/2006/main">
+              <a:graphicData uri="http://schemas.openxmlformats.org/drawingml/2006/picture">
+                <pic:pic xmlns:pic="http://schemas.openxmlformats.org/drawingml/2006/picture">
+                  <pic:nvPicPr>
+                    <pic:cNvPr id="261870494" name=""/>
+                    <pic:cNvPicPr/>
+                  </pic:nvPicPr>
+                  <pic:blipFill>
+                    <a:blip r:embed="rId13"/>
+                    <a:stretch>
+                      <a:fillRect/>
+                    </a:stretch>
+                  </pic:blipFill>
+                  <pic:spPr>
+                    <a:xfrm>
+                      <a:off x="0" y="0"/>
+                      <a:ext cx="12585510" cy="7667740"/>
+                    </a:xfrm>
+                    <a:prstGeom prst="rect">
+                      <a:avLst/>
+                    </a:prstGeom>
+                  </pic:spPr>
+                </pic:pic>
+              </a:graphicData>
+            </a:graphic>
+          </wp:inline>
+        </w:drawing>
+      </w:r>
+    </w:p>
+    <w:p>
+      <w:r>
+        <w:rPr>
+          <w:b/>
+          <w:bCs/>
+        </w:rPr>
+        <w:t>The finding, and why it's more interesting than "missing topology":</w:t>
+      </w:r>
+      <w:r>
+        <w:t xml:space="preserve"> a relationship </w:t>
+      </w:r>
+      <w:r>
+        <w:rPr>
+          <w:i/>
+          <w:iCs/>
+        </w:rPr>
+        <w:t>does</w:t>
+      </w:r>
+      <w:r>
+        <w:t xml:space="preserve"> exist between the two affected entities — the service belongs_to the deployment. This is not a Stage 2 topology gap; the link is there. So why no root cause</w:t>
+      </w:r>
+      <w:r>
+        <w:t xml:space="preserve">  by deterministic</w:t>
+      </w:r>
+      <w:r>
+        <w:t>?</w:t>
+      </w:r>
+    </w:p>
+    <w:p>
+      <w:pPr>
+        <w:spacing w:after="60"/>
+        <w:ind w:left="280"/>
+      </w:pPr>
+      <w:r>
+        <w:rPr>
+          <w:noProof/>
+        </w:rPr>
+        <w:drawing>
+          <wp:inline distT="0" distB="0" distL="0" distR="0" wp14:anchorId="2277DF56" wp14:editId="6BBFA51B">
+            <wp:extent cx="7520921" cy="7429500"/>
+            <wp:effectExtent l="0" t="0" r="4445" b="0"/>
+            <wp:docPr id="1503175195" name="Picture 1"/>
+            <wp:cNvGraphicFramePr>
+              <a:graphicFrameLocks xmlns:a="http://schemas.openxmlformats.org/drawingml/2006/main" noChangeAspect="1"/>
+            </wp:cNvGraphicFramePr>
+            <a:graphic xmlns:a="http://schemas.openxmlformats.org/drawingml/2006/main">
+              <a:graphicData uri="http://schemas.openxmlformats.org/drawingml/2006/picture">
+                <pic:pic xmlns:pic="http://schemas.openxmlformats.org/drawingml/2006/picture">
+                  <pic:nvPicPr>
+                    <pic:cNvPr id="1503175195" name=""/>
+                    <pic:cNvPicPr/>
+                  </pic:nvPicPr>
+                  <pic:blipFill>
+                    <a:blip r:embed="rId14"/>
+                    <a:stretch>
+                      <a:fillRect/>
+                    </a:stretch>
+                  </pic:blipFill>
+                  <pic:spPr>
+                    <a:xfrm>
+                      <a:off x="0" y="0"/>
+                      <a:ext cx="7524549" cy="7433084"/>
+                    </a:xfrm>
+                    <a:prstGeom prst="rect">
+                      <a:avLst/>
+                    </a:prstGeom>
+                  </pic:spPr>
+                </pic:pic>
+              </a:graphicData>
+            </a:graphic>
+          </wp:inline>
+        </w:drawing>
       </w:r>
     </w:p>
     <w:p>
@@ -12253,6 +13189,242 @@
         </w:rPr>
         <w:t>The hypothesis about which edge types are treated as causal is not confirmed with the product team. Do not assert it as fact.</w:t>
       </w:r>
+    </w:p>
+    <w:p>
+      <w:pPr>
+        <w:spacing w:before="260" w:after="100"/>
+        <w:rPr>
+          <w:b/>
+          <w:bCs/>
+          <w:color w:val="202020"/>
+          <w:sz w:val="22"/>
+          <w:szCs w:val="22"/>
+        </w:rPr>
+      </w:pPr>
+      <w:r>
+        <w:rPr>
+          <w:b/>
+          <w:bCs/>
+          <w:color w:val="FFFFFF"/>
+          <w:sz w:val="19"/>
+          <w:szCs w:val="19"/>
+          <w:highlight w:val="darkBlue"/>
+        </w:rPr>
+        <w:t>SLIDE 3</w:t>
+      </w:r>
+      <w:r>
+        <w:rPr>
+          <w:b/>
+          <w:bCs/>
+          <w:color w:val="FFFFFF"/>
+          <w:sz w:val="19"/>
+          <w:szCs w:val="19"/>
+          <w:highlight w:val="darkBlue"/>
+        </w:rPr>
+        <w:t>7.1</w:t>
+      </w:r>
+      <w:r>
+        <w:rPr>
+          <w:b/>
+          <w:bCs/>
+          <w:color w:val="202020"/>
+          <w:sz w:val="22"/>
+          <w:szCs w:val="22"/>
+        </w:rPr>
+        <w:t xml:space="preserve">  P-2 — </w:t>
+      </w:r>
+      <w:r>
+        <w:rPr>
+          <w:b/>
+          <w:bCs/>
+          <w:color w:val="202020"/>
+          <w:sz w:val="22"/>
+          <w:szCs w:val="22"/>
+        </w:rPr>
+        <w:t xml:space="preserve">Answer is TCCA </w:t>
+      </w:r>
+    </w:p>
+    <w:p>
+      <w:pPr>
+        <w:spacing w:after="60"/>
+        <w:ind w:left="280"/>
+      </w:pPr>
+      <w:r>
+        <w:rPr>
+          <w:b/>
+          <w:bCs/>
+        </w:rPr>
+        <w:t>Sub-header:</w:t>
+      </w:r>
+      <w:r>
+        <w:rPr>
+          <w:b/>
+          <w:bCs/>
+        </w:rPr>
+        <w:t xml:space="preserve"> How</w:t>
+      </w:r>
+      <w:r>
+        <w:rPr>
+          <w:b/>
+          <w:bCs/>
+        </w:rPr>
+        <w:t xml:space="preserve"> </w:t>
+      </w:r>
+      <w:hyperlink r:id="rId15" w:tgtFrame="_blank" w:tooltip="https://juno.internal.dynatrace.com/docs/observability/component/gen3-rca/tcca/" w:history="1">
+        <w:r>
+          <w:rPr>
+            <w:rStyle w:val="Hyperlink"/>
+          </w:rPr>
+          <w:t>TopologyCausalChainAnalyzer</w:t>
+        </w:r>
+      </w:hyperlink>
+      <w:r>
+        <w:t xml:space="preserve"> </w:t>
+      </w:r>
+      <w:r>
+        <w:t>builds a causal chain</w:t>
+      </w:r>
+    </w:p>
+    <w:p>
+      <w:pPr>
+        <w:spacing w:after="60"/>
+        <w:ind w:left="280"/>
+      </w:pPr>
+      <w:r>
+        <w:t>This should be on slide repeat all but make it following presentation style and dynamic</w:t>
+      </w:r>
+    </w:p>
+    <w:p>
+      <w:pPr>
+        <w:spacing w:after="60"/>
+        <w:ind w:left="280"/>
+      </w:pPr>
+      <w:r>
+        <w:rPr>
+          <w:noProof/>
+        </w:rPr>
+        <w:drawing>
+          <wp:inline distT="0" distB="0" distL="0" distR="0" wp14:anchorId="70DF4962" wp14:editId="1CB725C7">
+            <wp:extent cx="9446260" cy="4364990"/>
+            <wp:effectExtent l="0" t="0" r="2540" b="0"/>
+            <wp:docPr id="1593561936" name="Picture 1"/>
+            <wp:cNvGraphicFramePr>
+              <a:graphicFrameLocks xmlns:a="http://schemas.openxmlformats.org/drawingml/2006/main" noChangeAspect="1"/>
+            </wp:cNvGraphicFramePr>
+            <a:graphic xmlns:a="http://schemas.openxmlformats.org/drawingml/2006/main">
+              <a:graphicData uri="http://schemas.openxmlformats.org/drawingml/2006/picture">
+                <pic:pic xmlns:pic="http://schemas.openxmlformats.org/drawingml/2006/picture">
+                  <pic:nvPicPr>
+                    <pic:cNvPr id="0" name="Picture 1"/>
+                    <pic:cNvPicPr>
+                      <a:picLocks noChangeAspect="1" noChangeArrowheads="1"/>
+                    </pic:cNvPicPr>
+                  </pic:nvPicPr>
+                  <pic:blipFill>
+                    <a:blip r:embed="rId16">
+                      <a:extLst>
+                        <a:ext uri="{28A0092B-C50C-407E-A947-70E740481C1C}">
+                          <a14:useLocalDpi xmlns:a14="http://schemas.microsoft.com/office/drawing/2010/main" val="0"/>
+                        </a:ext>
+                      </a:extLst>
+                    </a:blip>
+                    <a:srcRect/>
+                    <a:stretch>
+                      <a:fillRect/>
+                    </a:stretch>
+                  </pic:blipFill>
+                  <pic:spPr bwMode="auto">
+                    <a:xfrm>
+                      <a:off x="0" y="0"/>
+                      <a:ext cx="9446260" cy="4364990"/>
+                    </a:xfrm>
+                    <a:prstGeom prst="rect">
+                      <a:avLst/>
+                    </a:prstGeom>
+                    <a:noFill/>
+                    <a:ln>
+                      <a:noFill/>
+                    </a:ln>
+                  </pic:spPr>
+                </pic:pic>
+              </a:graphicData>
+            </a:graphic>
+          </wp:inline>
+        </w:drawing>
+      </w:r>
+    </w:p>
+    <w:p>
+      <w:pPr>
+        <w:spacing w:after="60"/>
+        <w:ind w:left="280"/>
+      </w:pPr>
+    </w:p>
+    <w:p>
+      <w:pPr>
+        <w:spacing w:after="60"/>
+        <w:ind w:left="280"/>
+        <w:rPr>
+          <w:b/>
+          <w:bCs/>
+        </w:rPr>
+      </w:pPr>
+      <w:r>
+        <w:rPr>
+          <w:b/>
+          <w:bCs/>
+        </w:rPr>
+        <w:t>Speaker notes (30 seconds)</w:t>
+      </w:r>
+      <w:r>
+        <w:rPr>
+          <w:b/>
+          <w:bCs/>
+        </w:rPr>
+        <w:t xml:space="preserve"> (add them below the slide only)</w:t>
+      </w:r>
+    </w:p>
+    <w:p>
+      <w:pPr>
+        <w:spacing w:after="60"/>
+        <w:ind w:left="280"/>
+      </w:pPr>
+      <w:r>
+        <w:t xml:space="preserve">"TCCA is what turns five separate alerts into one problem with a root cause and a Visual Resolution Path. It only draws a causal link when two things are both connected in the topology </w:t>
+      </w:r>
+      <w:r>
+        <w:rPr>
+          <w:i/>
+          <w:iCs/>
+        </w:rPr>
+        <w:t>and</w:t>
+      </w:r>
+      <w:r>
+        <w:t xml:space="preserve"> alerting at the same time. The relationships it follows are curated, not automatic - each one is switched on deliberately, because every enabled relationship costs traversal work on every problem, and a wrong causal link is worse than no link. Kubernetes deployment membership simply hasn't been switched on yet. That's an enablement step, not a redesign."</w:t>
+      </w:r>
+    </w:p>
+    <w:p>
+      <w:pPr>
+        <w:spacing w:after="60"/>
+        <w:ind w:left="280"/>
+      </w:pPr>
+    </w:p>
+    <w:p>
+      <w:pPr>
+        <w:spacing w:before="260" w:after="100"/>
+      </w:pPr>
+    </w:p>
+    <w:p>
+      <w:pPr>
+        <w:spacing w:before="260" w:after="100"/>
+        <w:rPr>
+          <w:b/>
+          <w:bCs/>
+          <w:color w:val="FFFFFF"/>
+          <w:sz w:val="19"/>
+          <w:szCs w:val="19"/>
+          <w:highlight w:val="darkBlue"/>
+        </w:rPr>
+      </w:pPr>
     </w:p>
     <w:p>
       <w:pPr>
@@ -13683,8 +14855,6 @@
       <w:pPr>
         <w:spacing w:after="60"/>
         <w:ind w:left="280"/>
-      </w:pPr>
-      <w:r>
         <w:rPr>
           <w:b/>
           <w:bCs/>
@@ -13692,6 +14862,15 @@
           <w:sz w:val="19"/>
           <w:szCs w:val="19"/>
         </w:rPr>
+      </w:pPr>
+      <w:r>
+        <w:rPr>
+          <w:b/>
+          <w:bCs/>
+          <w:color w:val="C00000"/>
+          <w:sz w:val="19"/>
+          <w:szCs w:val="19"/>
+        </w:rPr>
         <w:t>VISUAL — SCHEMA: Stages 2–6 → clean problem → fans out to ITSM, on-call, chat.</w:t>
       </w:r>
       <w:r>
@@ -13758,6 +14937,67 @@
           <w:highlight w:val="yellow"/>
         </w:rPr>
         <w:t xml:space="preserve"> Content doc)</w:t>
+      </w:r>
+    </w:p>
+    <w:p>
+      <w:pPr>
+        <w:spacing w:after="60"/>
+        <w:ind w:left="280"/>
+      </w:pPr>
+      <w:r>
+        <w:rPr>
+          <w:b/>
+          <w:bCs/>
+          <w:noProof/>
+        </w:rPr>
+        <w:drawing>
+          <wp:inline distT="0" distB="0" distL="0" distR="0" wp14:anchorId="57E380E7" wp14:editId="33D59B96">
+            <wp:extent cx="14594774" cy="8164530"/>
+            <wp:effectExtent l="0" t="0" r="0" b="8255"/>
+            <wp:docPr id="1038222237" name="Picture 8"/>
+            <wp:cNvGraphicFramePr>
+              <a:graphicFrameLocks xmlns:a="http://schemas.openxmlformats.org/drawingml/2006/main" noChangeAspect="1"/>
+            </wp:cNvGraphicFramePr>
+            <a:graphic xmlns:a="http://schemas.openxmlformats.org/drawingml/2006/main">
+              <a:graphicData uri="http://schemas.openxmlformats.org/drawingml/2006/picture">
+                <pic:pic xmlns:pic="http://schemas.openxmlformats.org/drawingml/2006/picture">
+                  <pic:nvPicPr>
+                    <pic:cNvPr id="0" name="Picture 5"/>
+                    <pic:cNvPicPr>
+                      <a:picLocks noChangeAspect="1" noChangeArrowheads="1"/>
+                    </pic:cNvPicPr>
+                  </pic:nvPicPr>
+                  <pic:blipFill>
+                    <a:blip r:embed="rId17" cstate="print">
+                      <a:extLst>
+                        <a:ext uri="{28A0092B-C50C-407E-A947-70E740481C1C}">
+                          <a14:useLocalDpi xmlns:a14="http://schemas.microsoft.com/office/drawing/2010/main" val="0"/>
+                        </a:ext>
+                      </a:extLst>
+                    </a:blip>
+                    <a:srcRect/>
+                    <a:stretch>
+                      <a:fillRect/>
+                    </a:stretch>
+                  </pic:blipFill>
+                  <pic:spPr bwMode="auto">
+                    <a:xfrm>
+                      <a:off x="0" y="0"/>
+                      <a:ext cx="14603912" cy="8169642"/>
+                    </a:xfrm>
+                    <a:prstGeom prst="rect">
+                      <a:avLst/>
+                    </a:prstGeom>
+                    <a:noFill/>
+                    <a:ln>
+                      <a:noFill/>
+                    </a:ln>
+                  </pic:spPr>
+                </pic:pic>
+              </a:graphicData>
+            </a:graphic>
+          </wp:inline>
+        </w:drawing>
       </w:r>
     </w:p>
     <w:p>
@@ -14955,8 +16195,8 @@
       </w:r>
     </w:p>
     <w:sectPr>
-      <w:headerReference w:type="default" r:id="rId11"/>
-      <w:footerReference w:type="default" r:id="rId12"/>
+      <w:headerReference w:type="default" r:id="rId18"/>
+      <w:footerReference w:type="default" r:id="rId19"/>
       <w:pgSz w:w="12240" w:h="15840"/>
       <w:pgMar w:top="1100" w:right="1100" w:bottom="1100" w:left="1100" w:header="708" w:footer="708" w:gutter="0"/>
       <w:cols w:space="720"/>
@@ -15668,6 +16908,7 @@
   <w:style w:type="paragraph" w:default="1" w:styleId="Normal">
     <w:name w:val="Normal"/>
     <w:qFormat/>
+    <w:rsid w:val="00BC6889"/>
   </w:style>
   <w:style w:type="paragraph" w:styleId="Heading1">
     <w:name w:val="heading 1"/>
@@ -15756,7 +16997,6 @@
   <w:style w:type="character" w:default="1" w:styleId="DefaultParagraphFont">
     <w:name w:val="Default Paragraph Font"/>
     <w:uiPriority w:val="1"/>
-    <w:semiHidden/>
     <w:unhideWhenUsed/>
   </w:style>
   <w:style w:type="table" w:default="1" w:styleId="TableNormal">
@@ -15959,6 +17199,41 @@
     <w:rPr>
       <w:i/>
       <w:iCs/>
+    </w:rPr>
+  </w:style>
+  <w:style w:type="paragraph" w:styleId="HTMLPreformatted">
+    <w:name w:val="HTML Preformatted"/>
+    <w:basedOn w:val="Normal"/>
+    <w:link w:val="HTMLPreformattedChar"/>
+    <w:uiPriority w:val="99"/>
+    <w:semiHidden/>
+    <w:unhideWhenUsed/>
+    <w:rsid w:val="00003C62"/>
+    <w:rPr>
+      <w:rFonts w:ascii="Consolas" w:hAnsi="Consolas"/>
+    </w:rPr>
+  </w:style>
+  <w:style w:type="character" w:customStyle="1" w:styleId="HTMLPreformattedChar">
+    <w:name w:val="HTML Preformatted Char"/>
+    <w:basedOn w:val="DefaultParagraphFont"/>
+    <w:link w:val="HTMLPreformatted"/>
+    <w:uiPriority w:val="99"/>
+    <w:semiHidden/>
+    <w:rsid w:val="00003C62"/>
+    <w:rPr>
+      <w:rFonts w:ascii="Consolas" w:hAnsi="Consolas"/>
+    </w:rPr>
+  </w:style>
+  <w:style w:type="character" w:styleId="UnresolvedMention">
+    <w:name w:val="Unresolved Mention"/>
+    <w:basedOn w:val="DefaultParagraphFont"/>
+    <w:uiPriority w:val="99"/>
+    <w:semiHidden/>
+    <w:unhideWhenUsed/>
+    <w:rsid w:val="00003C62"/>
+    <w:rPr>
+      <w:color w:val="605E5C"/>
+      <w:shd w:val="clear" w:color="auto" w:fill="E1DFDD"/>
     </w:rPr>
   </w:style>
 </w:styles>
@@ -16280,15 +17555,6 @@
 </file>
 
 <file path=customXml/item1.xml><?xml version="1.0" encoding="utf-8"?>
-<?mso-contentType ?>
-<FormTemplates xmlns="http://schemas.microsoft.com/sharepoint/v3/contenttype/forms">
-  <Display>DocumentLibraryForm</Display>
-  <Edit>DocumentLibraryForm</Edit>
-  <New>DocumentLibraryForm</New>
-</FormTemplates>
-</file>
-
-<file path=customXml/item2.xml><?xml version="1.0" encoding="utf-8"?>
 <ct:contentTypeSchema xmlns:ct="http://schemas.microsoft.com/office/2006/metadata/contentType" xmlns:ma="http://schemas.microsoft.com/office/2006/metadata/properties/metaAttributes" ct:_="" ma:_="" ma:contentTypeName="Document" ma:contentTypeID="0x01010036A08C8BC4D63049A18BD1DD418AE7F4" ma:contentTypeVersion="15" ma:contentTypeDescription="Create a new document." ma:contentTypeScope="" ma:versionID="f2018b386391a1becbfbd280d90b0f69">
   <xsd:schema xmlns:xsd="http://www.w3.org/2001/XMLSchema" xmlns:xs="http://www.w3.org/2001/XMLSchema" xmlns:p="http://schemas.microsoft.com/office/2006/metadata/properties" xmlns:ns2="6087db69-3231-43dc-acc8-387c14e0f9ef" xmlns:ns3="c45c7f72-c8e0-472e-8212-c8c8e0ae7a99" targetNamespace="http://schemas.microsoft.com/office/2006/metadata/properties" ma:root="true" ma:fieldsID="79a14cabb9de21912efb131c058344c8" ns2:_="" ns3:_="">
     <xsd:import namespace="6087db69-3231-43dc-acc8-387c14e0f9ef"/>
@@ -16495,6 +17761,15 @@
 </ct:contentTypeSchema>
 </file>
 
+<file path=customXml/item2.xml><?xml version="1.0" encoding="utf-8"?>
+<?mso-contentType ?>
+<FormTemplates xmlns="http://schemas.microsoft.com/sharepoint/v3/contenttype/forms">
+  <Display>DocumentLibraryForm</Display>
+  <Edit>DocumentLibraryForm</Edit>
+  <New>DocumentLibraryForm</New>
+</FormTemplates>
+</file>
+
 <file path=customXml/item3.xml><?xml version="1.0" encoding="utf-8"?>
 <p:properties xmlns:p="http://schemas.microsoft.com/office/2006/metadata/properties" xmlns:xsi="http://www.w3.org/2001/XMLSchema-instance" xmlns:pc="http://schemas.microsoft.com/office/infopath/2007/PartnerControls">
   <documentManagement>
@@ -16507,14 +17782,6 @@
 </file>
 
 <file path=customXml/itemProps1.xml><?xml version="1.0" encoding="utf-8"?>
-<ds:datastoreItem xmlns:ds="http://schemas.openxmlformats.org/officeDocument/2006/customXml" ds:itemID="{7C8D7E55-1144-4B6A-B59D-B85EC1499794}">
-  <ds:schemaRefs>
-    <ds:schemaRef ds:uri="http://schemas.microsoft.com/sharepoint/v3/contenttype/forms"/>
-  </ds:schemaRefs>
-</ds:datastoreItem>
-</file>
-
-<file path=customXml/itemProps2.xml><?xml version="1.0" encoding="utf-8"?>
 <ds:datastoreItem xmlns:ds="http://schemas.openxmlformats.org/officeDocument/2006/customXml" ds:itemID="{1A2D89E8-7AA1-4D5D-A713-76990ADDF1DF}">
   <ds:schemaRefs>
     <ds:schemaRef ds:uri="http://schemas.microsoft.com/office/2006/metadata/contentType"/>
@@ -16533,6 +17800,14 @@
 </ds:datastoreItem>
 </file>
 
+<file path=customXml/itemProps2.xml><?xml version="1.0" encoding="utf-8"?>
+<ds:datastoreItem xmlns:ds="http://schemas.openxmlformats.org/officeDocument/2006/customXml" ds:itemID="{7C8D7E55-1144-4B6A-B59D-B85EC1499794}">
+  <ds:schemaRefs>
+    <ds:schemaRef ds:uri="http://schemas.microsoft.com/sharepoint/v3/contenttype/forms"/>
+  </ds:schemaRefs>
+</ds:datastoreItem>
+</file>
+
 <file path=customXml/itemProps3.xml><?xml version="1.0" encoding="utf-8"?>
 <ds:datastoreItem xmlns:ds="http://schemas.openxmlformats.org/officeDocument/2006/customXml" ds:itemID="{E444BCD3-B947-4D24-8E49-B24C2A3B32B2}">
   <ds:schemaRefs>

</xml_diff>